<commit_message>
paper: give the ICIP short paper the same title as the long paper
</commit_message>
<xml_diff>
--- a/output/paper/ICIP_Paper.docx
+++ b/output/paper/ICIP_Paper.docx
@@ -7,13 +7,19 @@
         <w:pStyle w:val="Title"/>
       </w:pPr>
       <w:r>
-        <w:t xml:space="preserve">Deterministic Self-Embedding Fragile Watermarking</w:t>
-      </w:r>
-      <w:r>
-        <w:br/>
-      </w:r>
-      <w:r>
-        <w:t xml:space="preserve">for Joint Tamper Localization and Content Recovery</w:t>
+        <w:t xml:space="preserve">Watermark-Guided Tamper Localization and Recovery: A Key-Seeded</w:t>
+      </w:r>
+      <w:r>
+        <w:t xml:space="preserve"> </w:t>
+      </w:r>
+      <w:r>
+        <w:t xml:space="preserve">Self-Embedding Fragile Watermarking Scheme with Joint Localization and</w:t>
+      </w:r>
+      <w:r>
+        <w:t xml:space="preserve"> </w:t>
+      </w:r>
+      <w:r>
+        <w:t xml:space="preserve">Restoration Assessment</w:t>
       </w:r>
     </w:p>
     <w:p>

</xml_diff>

<commit_message>
paper: number the ICIP authors 1-3 and drop the corresponding-author line
</commit_message>
<xml_diff>
--- a/output/paper/ICIP_Paper.docx
+++ b/output/paper/ICIP_Paper.docx
@@ -33,7 +33,31 @@
         </w:sectPr>
       </w:pPr>
       <w:r>
-        <w:t xml:space="preserve">Tejas Mane*, Shivam Singh†, Amol Hipparkar‡</w:t>
+        <w:t xml:space="preserve">Tejas Mane</w:t>
+      </w:r>
+      <w:r>
+        <w:rPr>
+          <w:vertAlign w:val="superscript"/>
+        </w:rPr>
+        <w:t xml:space="preserve">1</w:t>
+      </w:r>
+      <w:r>
+        <w:t xml:space="preserve">, Shivam Singh</w:t>
+      </w:r>
+      <w:r>
+        <w:rPr>
+          <w:vertAlign w:val="superscript"/>
+        </w:rPr>
+        <w:t xml:space="preserve">2</w:t>
+      </w:r>
+      <w:r>
+        <w:t xml:space="preserve">, Amol Hipparkar</w:t>
+      </w:r>
+      <w:r>
+        <w:rPr>
+          <w:vertAlign w:val="superscript"/>
+        </w:rPr>
+        <w:t xml:space="preserve">3</w:t>
       </w:r>
       <w:r>
         <w:br/>
@@ -51,25 +75,43 @@
         <w:br/>
       </w:r>
       <w:r>
-        <w:t xml:space="preserve">Email: *manetejas710@gmail.com,</w:t>
-      </w:r>
-      <w:r>
-        <w:t xml:space="preserve"> </w:t>
-      </w:r>
-      <w:r>
-        <w:t xml:space="preserve">†notshivamsingh@gmail.com,</w:t>
-      </w:r>
-      <w:r>
-        <w:t xml:space="preserve"> </w:t>
-      </w:r>
-      <w:r>
-        <w:t xml:space="preserve">‡amolhipparkar04@gmail.com</w:t>
-      </w:r>
-      <w:r>
-        <w:br/>
-      </w:r>
-      <w:r>
-        <w:t xml:space="preserve">*Corresponding author</w:t>
+        <w:t xml:space="preserve">Email:</w:t>
+      </w:r>
+      <w:r>
+        <w:t xml:space="preserve"> </w:t>
+      </w:r>
+      <w:r>
+        <w:rPr>
+          <w:vertAlign w:val="superscript"/>
+        </w:rPr>
+        <w:t xml:space="preserve">1</w:t>
+      </w:r>
+      <w:r>
+        <w:t xml:space="preserve">manetejas710@gmail.com,</w:t>
+      </w:r>
+      <w:r>
+        <w:t xml:space="preserve"> </w:t>
+      </w:r>
+      <w:r>
+        <w:rPr>
+          <w:vertAlign w:val="superscript"/>
+        </w:rPr>
+        <w:t xml:space="preserve">2</w:t>
+      </w:r>
+      <w:r>
+        <w:t xml:space="preserve">notshivamsingh@gmail.com,</w:t>
+      </w:r>
+      <w:r>
+        <w:t xml:space="preserve"> </w:t>
+      </w:r>
+      <w:r>
+        <w:rPr>
+          <w:vertAlign w:val="superscript"/>
+        </w:rPr>
+        <w:t xml:space="preserve">3</w:t>
+      </w:r>
+      <w:r>
+        <w:t xml:space="preserve">amolhipparkar04@gmail.com</w:t>
       </w:r>
       <w:r>
         <w:br/>

</xml_diff>